<commit_message>
Added Footprints for Passive components
</commit_message>
<xml_diff>
--- a/01Projectmanagement/T3000_Planung.docx
+++ b/01Projectmanagement/T3000_Planung.docx
@@ -299,7 +299,6 @@
               <w:rStyle w:val="Heading5Char"/>
             </w:rPr>
           </w:pPr>
-          <w:proofErr w:type="spellStart"/>
           <w:r>
             <w:rPr>
               <w:rStyle w:val="Heading5Char"/>
@@ -312,7 +311,6 @@
             </w:rPr>
             <w:t>sverzeichnis</w:t>
           </w:r>
-          <w:proofErr w:type="spellEnd"/>
         </w:p>
         <w:p>
           <w:pPr>
@@ -1545,7 +1543,7 @@
       </w:pPr>
       <w:bookmarkStart w:id="2" w:name="_Toc219273000"/>
       <w:r>
-        <w:t>Volz DA 30-HAT</w:t>
+        <w:t>Volz DA 30-HT</w:t>
       </w:r>
       <w:bookmarkEnd w:id="2"/>
     </w:p>
@@ -2571,47 +2569,7 @@
         <w:pStyle w:val="ListBullet2"/>
       </w:pPr>
       <w:r>
-        <w:t xml:space="preserve">ST </w:t>
-      </w:r>
-      <w:proofErr w:type="spellStart"/>
-      <w:r>
-        <w:t>morpho</w:t>
-      </w:r>
-      <w:proofErr w:type="spellEnd"/>
-      <w:r>
-        <w:t xml:space="preserve"> </w:t>
-      </w:r>
-      <w:proofErr w:type="spellStart"/>
-      <w:r>
-        <w:t>extension</w:t>
-      </w:r>
-      <w:proofErr w:type="spellEnd"/>
-      <w:r>
-        <w:t xml:space="preserve"> </w:t>
-      </w:r>
-      <w:proofErr w:type="spellStart"/>
-      <w:r>
-        <w:t>pin</w:t>
-      </w:r>
-      <w:proofErr w:type="spellEnd"/>
-      <w:r>
-        <w:t xml:space="preserve"> </w:t>
-      </w:r>
-      <w:proofErr w:type="spellStart"/>
-      <w:r>
-        <w:t>headers</w:t>
-      </w:r>
-      <w:proofErr w:type="spellEnd"/>
-      <w:r>
-        <w:t xml:space="preserve">: Gute Erweiterung für Motor-Kontroll-Platine und Zugang </w:t>
-      </w:r>
-      <w:proofErr w:type="gramStart"/>
-      <w:r>
-        <w:t>zu allen Input</w:t>
-      </w:r>
-      <w:proofErr w:type="gramEnd"/>
-      <w:r>
-        <w:t>/Output-Pins</w:t>
+        <w:t>ST morpho extension pin headers: Gute Erweiterung für Motor-Kontroll-Platine und Zugang zu allen Input/Output-Pins</w:t>
       </w:r>
     </w:p>
     <w:p>
@@ -2707,21 +2665,12 @@
           <w:bCs/>
         </w:rPr>
       </w:pPr>
-      <w:proofErr w:type="spellStart"/>
       <w:r>
         <w:rPr>
           <w:b/>
           <w:bCs/>
         </w:rPr>
-        <w:t>Pilotix</w:t>
-      </w:r>
-      <w:proofErr w:type="spellEnd"/>
-      <w:r>
-        <w:rPr>
-          <w:b/>
-          <w:bCs/>
-        </w:rPr>
-        <w:t xml:space="preserve"> 6210 210KV</w:t>
+        <w:t>Pilotix 6210 210KV</w:t>
       </w:r>
     </w:p>
     <w:p>
@@ -2738,15 +2687,7 @@
         <w:t>Eine Leistungselektronik, die für diesen Motor ausgelegt wird</w:t>
       </w:r>
       <w:r>
-        <w:t xml:space="preserve">, ist auch in der Lage den Wittenstein TPM Flight </w:t>
-      </w:r>
-      <w:proofErr w:type="spellStart"/>
-      <w:r>
-        <w:t>Actuator</w:t>
-      </w:r>
-      <w:proofErr w:type="spellEnd"/>
-      <w:r>
-        <w:t xml:space="preserve"> zu betreiben.</w:t>
+        <w:t>, ist auch in der Lage den Wittenstein TPM Flight Actuator zu betreiben.</w:t>
       </w:r>
     </w:p>
     <w:p>
@@ -2892,16 +2833,8 @@
         <w:rPr>
           <w:lang w:eastAsia="de-DE"/>
         </w:rPr>
-        <w:t xml:space="preserve">Zwischenphasenwiderstand: 42,5 </w:t>
-      </w:r>
-      <w:proofErr w:type="spellStart"/>
-      <w:r>
-        <w:rPr>
-          <w:lang w:eastAsia="de-DE"/>
-        </w:rPr>
-        <w:t>mΩ</w:t>
-      </w:r>
-      <w:proofErr w:type="spellEnd"/>
+        <w:t>Zwischenphasenwiderstand: 42,5 mΩ</w:t>
+      </w:r>
     </w:p>
     <w:p>
       <w:pPr>
@@ -3176,21 +3109,7 @@
           <w:rPr>
             <w:rStyle w:val="Hyperlink"/>
           </w:rPr>
-          <w:t xml:space="preserve">Mouser </w:t>
-        </w:r>
-        <w:proofErr w:type="spellStart"/>
-        <w:r>
-          <w:rPr>
-            <w:rStyle w:val="Hyperlink"/>
-          </w:rPr>
-          <w:t>Breakout</w:t>
-        </w:r>
-        <w:proofErr w:type="spellEnd"/>
-        <w:r>
-          <w:rPr>
-            <w:rStyle w:val="Hyperlink"/>
-          </w:rPr>
-          <w:t xml:space="preserve"> Board</w:t>
+          <w:t>Mouser Breakout Board</w:t>
         </w:r>
       </w:hyperlink>
     </w:p>
@@ -3317,29 +3236,13 @@
         <w:t>-</w:t>
       </w:r>
       <w:r>
-        <w:t xml:space="preserve">IPM, samt Gate-Driver, der auf </w:t>
-      </w:r>
-      <w:proofErr w:type="spellStart"/>
-      <w:r>
-        <w:t>GaN</w:t>
-      </w:r>
-      <w:proofErr w:type="spellEnd"/>
-      <w:r>
-        <w:t>-MOSFETs basiert und damit schnell genug schalten kann. Die Strom- und Spannungseigenschaften des IPMs lassen genug Puffer, sodass eine passive Kühlung ausreichen sollte.</w:t>
+        <w:t>IPM, samt Gate-Driver, der auf GaN-MOSFETs basiert und damit schnell genug schalten kann. Die Strom- und Spannungseigenschaften des IPMs lassen genug Puffer, sodass eine passive Kühlung ausreichen sollte.</w:t>
       </w:r>
       <w:r>
         <w:t xml:space="preserve"> Mit drei dieser Halbbrücken-IPMs lässt sich ein Inverter aufbauen. Zudem ist in diesem IPM keine Totzeit bereits integriert und es hat jeweils Eingänge für die High- und Low-Side, sodass der </w:t>
       </w:r>
       <w:r>
-        <w:t>Motor-Control-</w:t>
-      </w:r>
-      <w:proofErr w:type="spellStart"/>
-      <w:r>
-        <w:t>Timer</w:t>
-      </w:r>
-      <w:proofErr w:type="spellEnd"/>
-      <w:r>
-        <w:t xml:space="preserve"> des Mikroprozessors effizient genutzt werden kann und ein großer Konfigurationsfreiraum besteht.</w:t>
+        <w:t>Motor-Control-Timer des Mikroprozessors effizient genutzt werden kann und ein großer Konfigurationsfreiraum besteht.</w:t>
       </w:r>
     </w:p>
     <w:p>
@@ -3392,23 +3295,7 @@
         <w:pStyle w:val="ListBullet2"/>
       </w:pPr>
       <w:r>
-        <w:t>Maximalspannung: 100V (</w:t>
-      </w:r>
-      <w:proofErr w:type="spellStart"/>
-      <w:r>
-        <w:t>pulsed</w:t>
-      </w:r>
-      <w:proofErr w:type="spellEnd"/>
-      <w:r>
-        <w:t>) 93V(</w:t>
-      </w:r>
-      <w:proofErr w:type="spellStart"/>
-      <w:r>
-        <w:t>continuous</w:t>
-      </w:r>
-      <w:proofErr w:type="spellEnd"/>
-      <w:r>
-        <w:t>)</w:t>
+        <w:t>Maximalspannung: 100V (pulsed) 93V(continuous)</w:t>
       </w:r>
     </w:p>
     <w:p>
@@ -3664,15 +3551,7 @@
     </w:p>
     <w:p>
       <w:r>
-        <w:t xml:space="preserve">Um schon eine sichere Kompatibilität der ersten Iteration der Testplatform mit dem Wittenstein TPM Flight </w:t>
-      </w:r>
-      <w:proofErr w:type="spellStart"/>
-      <w:r>
-        <w:t>Actuator</w:t>
-      </w:r>
-      <w:proofErr w:type="spellEnd"/>
-      <w:r>
-        <w:t xml:space="preserve"> zu gewährleisten kann ein Resolver Digital-Converter IC verwendet werden. Solch ein IC übernimmt die Aufgaben der Erregerspulen-Signalerzeugung und wertet die Signale der Messspulen aus. Die Winkelinformationen stehen schnell und unkompliziert bereit.</w:t>
+        <w:t>Um schon eine sichere Kompatibilität der ersten Iteration der Testplatform mit dem Wittenstein TPM Flight Actuator zu gewährleisten kann ein Resolver Digital-Converter IC verwendet werden. Solch ein IC übernimmt die Aufgaben der Erregerspulen-Signalerzeugung und wertet die Signale der Messspulen aus. Die Winkelinformationen stehen schnell und unkompliziert bereit.</w:t>
       </w:r>
     </w:p>
     <w:p>
@@ -3689,24 +3568,14 @@
         <w:t>el</w:t>
       </w:r>
       <w:r>
-        <w:t xml:space="preserve"> mit dem Resolver </w:t>
-      </w:r>
-      <w:proofErr w:type="spellStart"/>
-      <w:r>
-        <w:t>de</w:t>
+        <w:t xml:space="preserve"> mit dem Resolver de</w:t>
       </w:r>
       <w:r>
         <w:t>a</w:t>
       </w:r>
-      <w:proofErr w:type="spellEnd"/>
-      <w:r>
-        <w:t xml:space="preserve"> Flight </w:t>
-      </w:r>
-      <w:proofErr w:type="spellStart"/>
-      <w:r>
-        <w:t>Actuator</w:t>
-      </w:r>
-      <w:proofErr w:type="spellEnd"/>
+      <w:r>
+        <w:t xml:space="preserve"> Flight Actuator</w:t>
+      </w:r>
       <w:r>
         <w:t xml:space="preserve"> und dem ausgewählten Mikrocontroller</w:t>
       </w:r>
@@ -8099,19 +7968,6 @@
 </file>
 
 <file path=customXml/item2.xml><?xml version="1.0" encoding="utf-8"?>
-<b:Sources xmlns:b="http://schemas.openxmlformats.org/officeDocument/2006/bibliography" xmlns="http://schemas.openxmlformats.org/officeDocument/2006/bibliography" SelectedStyle="\APASixthEditionOfficeOnline.xsl" StyleName="APA" Version="6"/>
-</file>
-
-<file path=customXml/item3.xml><?xml version="1.0" encoding="utf-8"?>
-<?mso-contentType ?>
-<FormTemplates xmlns="http://schemas.microsoft.com/sharepoint/v3/contenttype/forms">
-  <Display>DocumentLibraryForm</Display>
-  <Edit>DocumentLibraryForm</Edit>
-  <New>DocumentLibraryForm</New>
-</FormTemplates>
-</file>
-
-<file path=customXml/item4.xml><?xml version="1.0" encoding="utf-8"?>
 <ct:contentTypeSchema xmlns:ct="http://schemas.microsoft.com/office/2006/metadata/contentType" xmlns:ma="http://schemas.microsoft.com/office/2006/metadata/properties/metaAttributes" ct:_="" ma:_="" ma:contentTypeName="Dokument" ma:contentTypeID="0x010100FA582F6B90C5A444A1D826E245A8AA99" ma:contentTypeVersion="6" ma:contentTypeDescription="Ein neues Dokument erstellen." ma:contentTypeScope="" ma:versionID="9d2592aa4de057986924a7e6119d9920">
   <xsd:schema xmlns:xsd="http://www.w3.org/2001/XMLSchema" xmlns:xs="http://www.w3.org/2001/XMLSchema" xmlns:p="http://schemas.microsoft.com/office/2006/metadata/properties" xmlns:ns2="06e6c253-a114-4816-b563-23910202b880" xmlns:ns3="4cba27c1-93ad-4ec6-a55e-519ec955e064" targetNamespace="http://schemas.microsoft.com/office/2006/metadata/properties" ma:root="true" ma:fieldsID="a78d06fdde12ac38e8b08e0f35386ca7" ns2:_="" ns3:_="">
     <xsd:import namespace="06e6c253-a114-4816-b563-23910202b880"/>
@@ -8288,6 +8144,19 @@
 </ct:contentTypeSchema>
 </file>
 
+<file path=customXml/item3.xml><?xml version="1.0" encoding="utf-8"?>
+<?mso-contentType ?>
+<FormTemplates xmlns="http://schemas.microsoft.com/sharepoint/v3/contenttype/forms">
+  <Display>DocumentLibraryForm</Display>
+  <Edit>DocumentLibraryForm</Edit>
+  <New>DocumentLibraryForm</New>
+</FormTemplates>
+</file>
+
+<file path=customXml/item4.xml><?xml version="1.0" encoding="utf-8"?>
+<b:Sources xmlns:b="http://schemas.openxmlformats.org/officeDocument/2006/bibliography" xmlns="http://schemas.openxmlformats.org/officeDocument/2006/bibliography" SelectedStyle="\APASixthEditionOfficeOnline.xsl" StyleName="APA" Version="6"/>
+</file>
+
 <file path=customXml/itemProps1.xml><?xml version="1.0" encoding="utf-8"?>
 <ds:datastoreItem xmlns:ds="http://schemas.openxmlformats.org/officeDocument/2006/customXml" ds:itemID="{75EE1D19-C5F7-4292-92E3-0F06EC18A4EE}">
   <ds:schemaRefs>
@@ -8298,22 +8167,6 @@
 </file>
 
 <file path=customXml/itemProps2.xml><?xml version="1.0" encoding="utf-8"?>
-<ds:datastoreItem xmlns:ds="http://schemas.openxmlformats.org/officeDocument/2006/customXml" ds:itemID="{8617A24C-E68F-4CFB-AAC7-D8C94FAF7670}">
-  <ds:schemaRefs>
-    <ds:schemaRef ds:uri="http://schemas.openxmlformats.org/officeDocument/2006/bibliography"/>
-  </ds:schemaRefs>
-</ds:datastoreItem>
-</file>
-
-<file path=customXml/itemProps3.xml><?xml version="1.0" encoding="utf-8"?>
-<ds:datastoreItem xmlns:ds="http://schemas.openxmlformats.org/officeDocument/2006/customXml" ds:itemID="{081F818B-0EAC-46EC-9A18-72FEE8FF70F8}">
-  <ds:schemaRefs>
-    <ds:schemaRef ds:uri="http://schemas.microsoft.com/sharepoint/v3/contenttype/forms"/>
-  </ds:schemaRefs>
-</ds:datastoreItem>
-</file>
-
-<file path=customXml/itemProps4.xml><?xml version="1.0" encoding="utf-8"?>
 <ds:datastoreItem xmlns:ds="http://schemas.openxmlformats.org/officeDocument/2006/customXml" ds:itemID="{24373FCF-9D19-41E9-84C4-C86E2598198C}">
   <ds:schemaRefs>
     <ds:schemaRef ds:uri="http://schemas.microsoft.com/office/2006/metadata/contentType"/>
@@ -8330,4 +8183,20 @@
     <ds:schemaRef ds:uri="http://schemas.microsoft.com/internal/obd"/>
   </ds:schemaRefs>
 </ds:datastoreItem>
+</file>
+
+<file path=customXml/itemProps3.xml><?xml version="1.0" encoding="utf-8"?>
+<ds:datastoreItem xmlns:ds="http://schemas.openxmlformats.org/officeDocument/2006/customXml" ds:itemID="{081F818B-0EAC-46EC-9A18-72FEE8FF70F8}">
+  <ds:schemaRefs>
+    <ds:schemaRef ds:uri="http://schemas.microsoft.com/sharepoint/v3/contenttype/forms"/>
+  </ds:schemaRefs>
+</ds:datastoreItem>
+</file>
+
+<file path=customXml/itemProps4.xml><?xml version="1.0" encoding="utf-8"?>
+<ds:datastoreItem xmlns:ds="http://schemas.openxmlformats.org/officeDocument/2006/customXml" ds:itemID="{8617A24C-E68F-4CFB-AAC7-D8C94FAF7670}">
+  <ds:schemaRefs>
+    <ds:schemaRef ds:uri="http://schemas.openxmlformats.org/officeDocument/2006/bibliography"/>
+  </ds:schemaRefs>
+</ds:datastoreItem>
 </file>
</xml_diff>